<commit_message>
Change Name of Deployments to index.html
</commit_message>
<xml_diff>
--- a/Summary Report-Name.docx
+++ b/Summary Report-Name.docx
@@ -1,6 +1,6 @@
 
 <file path=word/document.xml><?xml version="1.0" encoding="utf-8"?>
-<w:document xmlns:wpc="http://schemas.microsoft.com/office/word/2010/wordprocessingCanvas" xmlns:cx="http://schemas.microsoft.com/office/drawing/2014/chartex" xmlns:cx1="http://schemas.microsoft.com/office/drawing/2015/9/8/chartex" xmlns:cx2="http://schemas.microsoft.com/office/drawing/2015/10/21/chartex" xmlns:cx3="http://schemas.microsoft.com/office/drawing/2016/5/9/chartex" xmlns:cx4="http://schemas.microsoft.com/office/drawing/2016/5/10/chartex" xmlns:cx5="http://schemas.microsoft.com/office/drawing/2016/5/11/chartex" xmlns:cx6="http://schemas.microsoft.com/office/drawing/2016/5/12/chartex" xmlns:cx7="http://schemas.microsoft.com/office/drawing/2016/5/13/chartex" xmlns:cx8="http://schemas.microsoft.com/office/drawing/2016/5/14/chartex" xmlns:mc="http://schemas.openxmlformats.org/markup-compatibility/2006" xmlns:aink="http://schemas.microsoft.com/office/drawing/2016/ink" xmlns:am3d="http://schemas.microsoft.com/office/drawing/2017/model3d" xmlns:o="urn:schemas-microsoft-com:office:office" xmlns:oel="http://schemas.microsoft.com/office/2019/extlst" xmlns:r="http://schemas.openxmlformats.org/officeDocument/2006/relationships" xmlns:m="http://schemas.openxmlformats.org/officeDocument/2006/math" xmlns:v="urn:schemas-microsoft-com:vml" xmlns:wp14="http://schemas.microsoft.com/office/word/2010/wordprocessingDrawing" xmlns:wp="http://schemas.openxmlformats.org/drawingml/2006/wordprocessingDrawing" xmlns:w10="urn:schemas-microsoft-com:office:word" xmlns:w="http://schemas.openxmlformats.org/wordprocessingml/2006/main" xmlns:w14="http://schemas.microsoft.com/office/word/2010/wordml" xmlns:w15="http://schemas.microsoft.com/office/word/2012/wordml" xmlns:w16cex="http://schemas.microsoft.com/office/word/2018/wordml/cex" xmlns:w16cid="http://schemas.microsoft.com/office/word/2016/wordml/cid" xmlns:w16="http://schemas.microsoft.com/office/word/2018/wordml" xmlns:w16du="http://schemas.microsoft.com/office/word/2023/wordml/word16du" xmlns:w16sdtdh="http://schemas.microsoft.com/office/word/2020/wordml/sdtdatahash" xmlns:w16se="http://schemas.microsoft.com/office/word/2015/wordml/symex" xmlns:wpg="http://schemas.microsoft.com/office/word/2010/wordprocessingGroup" xmlns:wpi="http://schemas.microsoft.com/office/word/2010/wordprocessingInk" xmlns:wne="http://schemas.microsoft.com/office/word/2006/wordml" xmlns:wps="http://schemas.microsoft.com/office/word/2010/wordprocessingShape" mc:Ignorable="w14 w15 w16se w16cid w16 w16cex w16sdtdh w16du wp14">
+<w:document xmlns:wpc="http://schemas.microsoft.com/office/word/2010/wordprocessingCanvas" xmlns:cx="http://schemas.microsoft.com/office/drawing/2014/chartex" xmlns:cx1="http://schemas.microsoft.com/office/drawing/2015/9/8/chartex" xmlns:cx2="http://schemas.microsoft.com/office/drawing/2015/10/21/chartex" xmlns:cx3="http://schemas.microsoft.com/office/drawing/2016/5/9/chartex" xmlns:cx4="http://schemas.microsoft.com/office/drawing/2016/5/10/chartex" xmlns:cx5="http://schemas.microsoft.com/office/drawing/2016/5/11/chartex" xmlns:cx6="http://schemas.microsoft.com/office/drawing/2016/5/12/chartex" xmlns:cx7="http://schemas.microsoft.com/office/drawing/2016/5/13/chartex" xmlns:cx8="http://schemas.microsoft.com/office/drawing/2016/5/14/chartex" xmlns:mc="http://schemas.openxmlformats.org/markup-compatibility/2006" xmlns:aink="http://schemas.microsoft.com/office/drawing/2016/ink" xmlns:am3d="http://schemas.microsoft.com/office/drawing/2017/model3d" xmlns:o="urn:schemas-microsoft-com:office:office" xmlns:oel="http://schemas.microsoft.com/office/2019/extlst" xmlns:r="http://schemas.openxmlformats.org/officeDocument/2006/relationships" xmlns:m="http://schemas.openxmlformats.org/officeDocument/2006/math" xmlns:v="urn:schemas-microsoft-com:vml" xmlns:wp14="http://schemas.microsoft.com/office/word/2010/wordprocessingDrawing" xmlns:wp="http://schemas.openxmlformats.org/drawingml/2006/wordprocessingDrawing" xmlns:w10="urn:schemas-microsoft-com:office:word" xmlns:w="http://schemas.openxmlformats.org/wordprocessingml/2006/main" xmlns:w14="http://schemas.microsoft.com/office/word/2010/wordml" xmlns:w15="http://schemas.microsoft.com/office/word/2012/wordml" xmlns:w16cex="http://schemas.microsoft.com/office/word/2018/wordml/cex" xmlns:w16cid="http://schemas.microsoft.com/office/word/2016/wordml/cid" xmlns:w16="http://schemas.microsoft.com/office/word/2018/wordml" xmlns:w16du="http://schemas.microsoft.com/office/word/2023/wordml/word16du" xmlns:w16sdtdh="http://schemas.microsoft.com/office/word/2020/wordml/sdtdatahash" xmlns:w16sdtfl="http://schemas.microsoft.com/office/word/2024/wordml/sdtformatlock" xmlns:w16se="http://schemas.microsoft.com/office/word/2015/wordml/symex" xmlns:wpg="http://schemas.microsoft.com/office/word/2010/wordprocessingGroup" xmlns:wpi="http://schemas.microsoft.com/office/word/2010/wordprocessingInk" xmlns:wne="http://schemas.microsoft.com/office/word/2006/wordml" xmlns:wps="http://schemas.microsoft.com/office/word/2010/wordprocessingShape" mc:Ignorable="w14 w15 w16se w16cid w16 w16cex w16sdtdh w16sdtfl w16du wp14">
   <w:body>
     <w:tbl>
       <w:tblPr>
@@ -16,7 +16,6 @@
         <w:tc>
           <w:tcPr>
             <w:tcW w:w="3368" w:type="dxa"/>
-            <w:shd w:val="clear" w:color="auto" w:fill="auto"/>
           </w:tcPr>
           <w:p>
             <w:pPr>
@@ -32,6 +31,7 @@
                 <w:sz w:val="24"/>
                 <w:szCs w:val="24"/>
                 <w:u w:val="single"/>
+                <w:lang w:eastAsia="zh-CN"/>
               </w:rPr>
             </w:pPr>
             <w:r>
@@ -70,12 +70,20 @@
               </w:rPr>
               <w:t xml:space="preserve"> </w:t>
             </w:r>
+            <w:r>
+              <w:rPr>
+                <w:rFonts w:ascii="Arial Narrow" w:hAnsi="Arial Narrow" w:cs="Arial" w:hint="eastAsia"/>
+                <w:sz w:val="24"/>
+                <w:szCs w:val="24"/>
+                <w:lang w:eastAsia="zh-CN"/>
+              </w:rPr>
+              <w:t xml:space="preserve"> Xingjia Yang</w:t>
+            </w:r>
           </w:p>
         </w:tc>
         <w:tc>
           <w:tcPr>
             <w:tcW w:w="6454" w:type="dxa"/>
-            <w:shd w:val="clear" w:color="auto" w:fill="auto"/>
           </w:tcPr>
           <w:p>
             <w:pPr>
@@ -89,6 +97,7 @@
                 <w:bCs/>
                 <w:sz w:val="24"/>
                 <w:szCs w:val="24"/>
+                <w:lang w:eastAsia="zh-CN"/>
               </w:rPr>
             </w:pPr>
             <w:r>
@@ -119,6 +128,24 @@
               </w:rPr>
               <w:t xml:space="preserve">: </w:t>
             </w:r>
+            <w:r>
+              <w:rPr>
+                <w:rFonts w:ascii="Arial Narrow" w:hAnsi="Arial Narrow" w:cs="Arial" w:hint="eastAsia"/>
+                <w:sz w:val="24"/>
+                <w:szCs w:val="24"/>
+                <w:lang w:eastAsia="zh-CN"/>
+              </w:rPr>
+              <w:t xml:space="preserve">A </w:t>
+            </w:r>
+            <w:r>
+              <w:rPr>
+                <w:rFonts w:ascii="Arial Narrow" w:hAnsi="Arial Narrow" w:cs="Arial" w:hint="eastAsia"/>
+                <w:sz w:val="24"/>
+                <w:szCs w:val="24"/>
+                <w:lang w:eastAsia="zh-CN"/>
+              </w:rPr>
+              <w:t xml:space="preserve">College Decision </w:t>
+            </w:r>
           </w:p>
         </w:tc>
       </w:tr>
@@ -127,7 +154,6 @@
           <w:tcPr>
             <w:tcW w:w="9822" w:type="dxa"/>
             <w:gridSpan w:val="2"/>
-            <w:shd w:val="clear" w:color="auto" w:fill="auto"/>
           </w:tcPr>
           <w:p>
             <w:pPr>
@@ -141,6 +167,7 @@
                 <w:bCs/>
                 <w:sz w:val="24"/>
                 <w:szCs w:val="24"/>
+                <w:lang w:eastAsia="zh-CN"/>
               </w:rPr>
             </w:pPr>
             <w:r>
@@ -153,6 +180,17 @@
               </w:rPr>
               <w:t xml:space="preserve">Your team member(s): </w:t>
             </w:r>
+            <w:r>
+              <w:rPr>
+                <w:rFonts w:ascii="Arial" w:hAnsi="Arial" w:cs="Arial" w:hint="eastAsia"/>
+                <w:b/>
+                <w:bCs/>
+                <w:sz w:val="24"/>
+                <w:szCs w:val="24"/>
+                <w:lang w:eastAsia="zh-CN"/>
+              </w:rPr>
+              <w:t>Xingjia Yang, Bohan Jiang, Tie Li</w:t>
+            </w:r>
           </w:p>
         </w:tc>
       </w:tr>
@@ -193,8 +231,32 @@
           <w:szCs w:val="24"/>
           <w:lang w:eastAsia="zh-CN"/>
         </w:rPr>
-        <w:t xml:space="preserve">Video Link: </w:t>
-      </w:r>
+        <w:t>Video Link</w:t>
+      </w:r>
+      <w:proofErr w:type="gramStart"/>
+      <w:r>
+        <w:rPr>
+          <w:rFonts w:ascii="Arial" w:hAnsi="Arial" w:cs="Arial" w:hint="eastAsia"/>
+          <w:b/>
+          <w:bCs/>
+          <w:sz w:val="24"/>
+          <w:szCs w:val="24"/>
+          <w:lang w:eastAsia="zh-CN"/>
+        </w:rPr>
+        <w:t xml:space="preserve">: </w:t>
+      </w:r>
+      <w:r>
+        <w:rPr>
+          <w:rFonts w:ascii="Arial" w:hAnsi="Arial" w:cs="Arial" w:hint="eastAsia"/>
+          <w:b/>
+          <w:bCs/>
+          <w:sz w:val="24"/>
+          <w:szCs w:val="24"/>
+          <w:lang w:eastAsia="zh-CN"/>
+        </w:rPr>
+        <w:t xml:space="preserve"> youtu.be</w:t>
+      </w:r>
+      <w:proofErr w:type="gramEnd"/>
     </w:p>
     <w:p>
       <w:pPr>
@@ -209,7 +271,7 @@
           <w:bCs/>
           <w:sz w:val="24"/>
           <w:szCs w:val="24"/>
-          <w:lang w:val="en-SG" w:eastAsia="zh-CN"/>
+          <w:lang w:eastAsia="zh-CN"/>
         </w:rPr>
       </w:pPr>
     </w:p>
@@ -249,148 +311,81 @@
         <w:spacing w:after="80" w:line="240" w:lineRule="auto"/>
         <w:jc w:val="both"/>
         <w:rPr>
-          <w:rFonts w:ascii="Times New Roman" w:eastAsia="Arial" w:hAnsi="Times New Roman"/>
-          <w:bCs/>
-          <w:color w:val="000000"/>
-          <w:sz w:val="24"/>
-          <w:szCs w:val="24"/>
-        </w:rPr>
-      </w:pPr>
-      <w:r>
-        <w:rPr>
-          <w:rFonts w:ascii="Times New Roman" w:eastAsia="Arial" w:hAnsi="Times New Roman"/>
-          <w:bCs/>
-          <w:color w:val="000000"/>
-          <w:sz w:val="24"/>
-          <w:szCs w:val="24"/>
-        </w:rPr>
-        <w:t>Describe</w:t>
-      </w:r>
-      <w:r>
-        <w:rPr>
-          <w:rFonts w:ascii="Times New Roman" w:eastAsia="Arial" w:hAnsi="Times New Roman"/>
-          <w:bCs/>
-          <w:color w:val="000000"/>
-          <w:sz w:val="24"/>
-          <w:szCs w:val="24"/>
-        </w:rPr>
-        <w:t xml:space="preserve"> clearly</w:t>
-      </w:r>
-      <w:r>
-        <w:rPr>
-          <w:rFonts w:ascii="Times New Roman" w:eastAsia="Arial" w:hAnsi="Times New Roman"/>
-          <w:bCs/>
-          <w:color w:val="000000"/>
-          <w:sz w:val="24"/>
-          <w:szCs w:val="24"/>
-        </w:rPr>
-        <w:t xml:space="preserve"> </w:t>
-      </w:r>
-      <w:r>
-        <w:rPr>
-          <w:rFonts w:ascii="Times New Roman" w:eastAsia="Arial" w:hAnsi="Times New Roman"/>
-          <w:bCs/>
-          <w:color w:val="000000"/>
-          <w:sz w:val="24"/>
-          <w:szCs w:val="24"/>
-        </w:rPr>
-        <w:t xml:space="preserve">the objectives of the </w:t>
-      </w:r>
-      <w:r>
-        <w:rPr>
-          <w:rFonts w:ascii="Times New Roman" w:eastAsia="Arial" w:hAnsi="Times New Roman"/>
-          <w:bCs/>
-          <w:color w:val="000000"/>
-          <w:sz w:val="24"/>
-          <w:szCs w:val="24"/>
-        </w:rPr>
-        <w:t xml:space="preserve">project </w:t>
-      </w:r>
-      <w:r>
-        <w:rPr>
-          <w:rFonts w:ascii="Times New Roman" w:eastAsia="Arial" w:hAnsi="Times New Roman"/>
-          <w:bCs/>
-          <w:color w:val="000000"/>
-          <w:sz w:val="24"/>
-          <w:szCs w:val="24"/>
-        </w:rPr>
-        <w:t>and the messages the presentation was meant to communicat</w:t>
-      </w:r>
-      <w:r>
-        <w:rPr>
-          <w:rFonts w:ascii="Times New Roman" w:eastAsia="Arial" w:hAnsi="Times New Roman"/>
-          <w:bCs/>
-          <w:color w:val="000000"/>
-          <w:sz w:val="24"/>
-          <w:szCs w:val="24"/>
-        </w:rPr>
-        <w:t>e</w:t>
-      </w:r>
-      <w:r>
-        <w:rPr>
-          <w:rFonts w:ascii="Times New Roman" w:eastAsia="Arial" w:hAnsi="Times New Roman"/>
-          <w:bCs/>
-          <w:color w:val="000000"/>
-          <w:sz w:val="24"/>
-          <w:szCs w:val="24"/>
-        </w:rPr>
-        <w:t xml:space="preserve">. </w:t>
-      </w:r>
-      <w:r>
-        <w:rPr>
-          <w:rFonts w:ascii="Times New Roman" w:eastAsia="Arial" w:hAnsi="Times New Roman"/>
-          <w:bCs/>
-          <w:color w:val="000000"/>
-          <w:sz w:val="24"/>
-          <w:szCs w:val="24"/>
-        </w:rPr>
-        <w:t>You should also briefly introduce the dataset.</w:t>
-      </w:r>
+          <w:rFonts w:ascii="Times New Roman" w:hAnsi="Times New Roman"/>
+          <w:bCs/>
+          <w:sz w:val="24"/>
+          <w:szCs w:val="24"/>
+          <w:lang w:eastAsia="zh-CN"/>
+        </w:rPr>
+      </w:pPr>
     </w:p>
     <w:p>
       <w:pPr>
         <w:spacing w:after="80" w:line="240" w:lineRule="auto"/>
-        <w:jc w:val="both"/>
-        <w:rPr>
-          <w:rFonts w:ascii="Times New Roman" w:eastAsia="Arial" w:hAnsi="Times New Roman"/>
-          <w:bCs/>
-          <w:color w:val="0000CC"/>
-          <w:sz w:val="24"/>
-          <w:szCs w:val="24"/>
-        </w:rPr>
-      </w:pPr>
-      <w:r>
-        <w:rPr>
-          <w:rFonts w:ascii="Times New Roman" w:eastAsia="Arial" w:hAnsi="Times New Roman"/>
-          <w:bCs/>
-          <w:color w:val="0000CC"/>
-          <w:sz w:val="24"/>
-          <w:szCs w:val="24"/>
-        </w:rPr>
-        <w:t>(</w:t>
-      </w:r>
-      <w:r>
-        <w:rPr>
-          <w:rFonts w:ascii="Times New Roman" w:eastAsia="Arial" w:hAnsi="Times New Roman"/>
-          <w:bCs/>
-          <w:i/>
-          <w:iCs/>
-          <w:color w:val="0000CC"/>
-          <w:sz w:val="24"/>
-          <w:szCs w:val="24"/>
-        </w:rPr>
-        <w:t>you may delete the description above and replace it with your own write up under the given heading</w:t>
-      </w:r>
-      <w:r>
-        <w:rPr>
-          <w:rFonts w:ascii="Times New Roman" w:eastAsia="Arial" w:hAnsi="Times New Roman"/>
-          <w:bCs/>
-          <w:color w:val="0000CC"/>
-          <w:sz w:val="24"/>
-          <w:szCs w:val="24"/>
-        </w:rPr>
-        <w:t>)</w:t>
-      </w:r>
+        <w:rPr>
+          <w:rFonts w:ascii="Times New Roman" w:hAnsi="Times New Roman"/>
+          <w:bCs/>
+          <w:sz w:val="24"/>
+          <w:szCs w:val="24"/>
+          <w:lang w:eastAsia="zh-CN"/>
+        </w:rPr>
+      </w:pPr>
+      <w:r>
+        <w:rPr>
+          <w:rFonts w:ascii="Times New Roman" w:hAnsi="Times New Roman"/>
+          <w:bCs/>
+          <w:sz w:val="24"/>
+          <w:szCs w:val="24"/>
+          <w:lang w:eastAsia="zh-CN"/>
+        </w:rPr>
+        <w:t>The objective of this project is to build a decision-support website for high school graduates and their parents during the college application process. Our goal is to make college-related information easier to understand and compare, so that users can evaluate whether a university is a good fit in terms of academic profile, affordability, and overall value. In the presentation, we focus on two main types of visualizations: one-year snapshots for comparing institutions at a specific point in time, and multi-year trend plots for showing how universities change over time. These visualizations are intended to help users make more informed decisions rather than relying only on general reputation or limited information.</w:t>
+      </w:r>
+    </w:p>
+    <w:p>
+      <w:pPr>
+        <w:spacing w:after="80" w:line="240" w:lineRule="auto"/>
+        <w:rPr>
+          <w:rFonts w:ascii="Times New Roman" w:hAnsi="Times New Roman"/>
+          <w:bCs/>
+          <w:sz w:val="24"/>
+          <w:szCs w:val="24"/>
+          <w:lang w:eastAsia="zh-CN"/>
+        </w:rPr>
+      </w:pPr>
+    </w:p>
+    <w:p>
+      <w:pPr>
+        <w:spacing w:after="80" w:line="240" w:lineRule="auto"/>
+        <w:rPr>
+          <w:rFonts w:ascii="Times New Roman" w:hAnsi="Times New Roman"/>
+          <w:bCs/>
+          <w:sz w:val="24"/>
+          <w:szCs w:val="24"/>
+          <w:lang w:eastAsia="zh-CN"/>
+        </w:rPr>
+      </w:pPr>
+      <w:r>
+        <w:rPr>
+          <w:rFonts w:ascii="Times New Roman" w:hAnsi="Times New Roman"/>
+          <w:bCs/>
+          <w:sz w:val="24"/>
+          <w:szCs w:val="24"/>
+          <w:lang w:eastAsia="zh-CN"/>
+        </w:rPr>
+        <w:t>The dataset used in this project is primarily based on the Integrated Postsecondary Education Data System (IPEDS), published by the U.S. Department of Education’s National Center for Education Statistics, and is supplemented with state-level macroeconomic indicators retrieved from FRED, the Federal Reserve Economic Data database maintained by the Federal Reserve Bank of St. Louis. Our team cleaned and reorganized the original IPEDS files into a more usable panel dataset covering U.S. colleges from 2017 to 2024. The dataset includes major information such as institutional characteristics, enrollment, admissions, completions, financial aid, tuition, financial indicators, and selected macroeconomic context variables at the state level. It should also be noted that some 2024 variables contain substantial missing values because several 2024 IPEDS source files were not yet available, so most of our analysis relies mainly on earlier years with more complete data.</w:t>
+      </w:r>
+    </w:p>
+    <w:p>
+      <w:pPr>
+        <w:spacing w:after="80" w:line="240" w:lineRule="auto"/>
+        <w:rPr>
+          <w:rFonts w:ascii="Times New Roman" w:hAnsi="Times New Roman"/>
+          <w:bCs/>
+          <w:sz w:val="24"/>
+          <w:szCs w:val="24"/>
+          <w:lang w:eastAsia="zh-CN"/>
+        </w:rPr>
+      </w:pPr>
     </w:p>
     <w:p>
       <w:pPr>
@@ -445,7 +440,29 @@
           <w:sz w:val="24"/>
           <w:szCs w:val="24"/>
         </w:rPr>
-        <w:t>Highlight what you think were original contributions in your data visualisation that you are particularly proud of</w:t>
+        <w:t xml:space="preserve">Highlight what you think were original contributions in your data </w:t>
+      </w:r>
+      <w:proofErr w:type="spellStart"/>
+      <w:r>
+        <w:rPr>
+          <w:rFonts w:ascii="Times New Roman" w:eastAsia="Arial" w:hAnsi="Times New Roman"/>
+          <w:bCs/>
+          <w:color w:val="000000"/>
+          <w:sz w:val="24"/>
+          <w:szCs w:val="24"/>
+        </w:rPr>
+        <w:t>visualisation</w:t>
+      </w:r>
+      <w:proofErr w:type="spellEnd"/>
+      <w:r>
+        <w:rPr>
+          <w:rFonts w:ascii="Times New Roman" w:eastAsia="Arial" w:hAnsi="Times New Roman"/>
+          <w:bCs/>
+          <w:color w:val="000000"/>
+          <w:sz w:val="24"/>
+          <w:szCs w:val="24"/>
+        </w:rPr>
+        <w:t xml:space="preserve"> that you are particularly proud of</w:t>
       </w:r>
       <w:r>
         <w:rPr>
@@ -465,7 +482,51 @@
           <w:sz w:val="24"/>
           <w:szCs w:val="24"/>
         </w:rPr>
-        <w:t>What new visualisation techniques did you use in creating the video presentation? If</w:t>
+        <w:t xml:space="preserve">What new </w:t>
+      </w:r>
+      <w:proofErr w:type="spellStart"/>
+      <w:r>
+        <w:rPr>
+          <w:rFonts w:ascii="Times New Roman" w:eastAsia="Arial" w:hAnsi="Times New Roman"/>
+          <w:bCs/>
+          <w:color w:val="000000"/>
+          <w:sz w:val="24"/>
+          <w:szCs w:val="24"/>
+        </w:rPr>
+        <w:t>visualisation</w:t>
+      </w:r>
+      <w:proofErr w:type="spellEnd"/>
+      <w:r>
+        <w:rPr>
+          <w:rFonts w:ascii="Times New Roman" w:eastAsia="Arial" w:hAnsi="Times New Roman"/>
+          <w:bCs/>
+          <w:color w:val="000000"/>
+          <w:sz w:val="24"/>
+          <w:szCs w:val="24"/>
+        </w:rPr>
+        <w:t xml:space="preserve"> techniques did you use in creating </w:t>
+      </w:r>
+      <w:proofErr w:type="gramStart"/>
+      <w:r>
+        <w:rPr>
+          <w:rFonts w:ascii="Times New Roman" w:eastAsia="Arial" w:hAnsi="Times New Roman"/>
+          <w:bCs/>
+          <w:color w:val="000000"/>
+          <w:sz w:val="24"/>
+          <w:szCs w:val="24"/>
+        </w:rPr>
+        <w:t>the video presentation</w:t>
+      </w:r>
+      <w:proofErr w:type="gramEnd"/>
+      <w:r>
+        <w:rPr>
+          <w:rFonts w:ascii="Times New Roman" w:eastAsia="Arial" w:hAnsi="Times New Roman"/>
+          <w:bCs/>
+          <w:color w:val="000000"/>
+          <w:sz w:val="24"/>
+          <w:szCs w:val="24"/>
+        </w:rPr>
+        <w:t>? If</w:t>
       </w:r>
       <w:r>
         <w:rPr>
@@ -656,7 +717,139 @@
           <w:sz w:val="24"/>
           <w:szCs w:val="24"/>
         </w:rPr>
-        <w:t>What visualisation tools did you employed in exploring your data and creating your visualisation and presentation? Describe any noteworthy technical contributions done during the design and implementation of the visualisation. What were the technically challenging aspects in creating the visualisation?</w:t>
+        <w:t xml:space="preserve">What </w:t>
+      </w:r>
+      <w:proofErr w:type="spellStart"/>
+      <w:r>
+        <w:rPr>
+          <w:rFonts w:ascii="Times New Roman" w:eastAsia="Arial" w:hAnsi="Times New Roman"/>
+          <w:bCs/>
+          <w:color w:val="000000"/>
+          <w:sz w:val="24"/>
+          <w:szCs w:val="24"/>
+        </w:rPr>
+        <w:t>visualisation</w:t>
+      </w:r>
+      <w:proofErr w:type="spellEnd"/>
+      <w:r>
+        <w:rPr>
+          <w:rFonts w:ascii="Times New Roman" w:eastAsia="Arial" w:hAnsi="Times New Roman"/>
+          <w:bCs/>
+          <w:color w:val="000000"/>
+          <w:sz w:val="24"/>
+          <w:szCs w:val="24"/>
+        </w:rPr>
+        <w:t xml:space="preserve"> tools did you </w:t>
+      </w:r>
+      <w:proofErr w:type="gramStart"/>
+      <w:r>
+        <w:rPr>
+          <w:rFonts w:ascii="Times New Roman" w:eastAsia="Arial" w:hAnsi="Times New Roman"/>
+          <w:bCs/>
+          <w:color w:val="000000"/>
+          <w:sz w:val="24"/>
+          <w:szCs w:val="24"/>
+        </w:rPr>
+        <w:t>employed</w:t>
+      </w:r>
+      <w:proofErr w:type="gramEnd"/>
+      <w:r>
+        <w:rPr>
+          <w:rFonts w:ascii="Times New Roman" w:eastAsia="Arial" w:hAnsi="Times New Roman"/>
+          <w:bCs/>
+          <w:color w:val="000000"/>
+          <w:sz w:val="24"/>
+          <w:szCs w:val="24"/>
+        </w:rPr>
+        <w:t xml:space="preserve"> in exploring your data and creating your </w:t>
+      </w:r>
+      <w:proofErr w:type="spellStart"/>
+      <w:r>
+        <w:rPr>
+          <w:rFonts w:ascii="Times New Roman" w:eastAsia="Arial" w:hAnsi="Times New Roman"/>
+          <w:bCs/>
+          <w:color w:val="000000"/>
+          <w:sz w:val="24"/>
+          <w:szCs w:val="24"/>
+        </w:rPr>
+        <w:t>visualisation</w:t>
+      </w:r>
+      <w:proofErr w:type="spellEnd"/>
+      <w:r>
+        <w:rPr>
+          <w:rFonts w:ascii="Times New Roman" w:eastAsia="Arial" w:hAnsi="Times New Roman"/>
+          <w:bCs/>
+          <w:color w:val="000000"/>
+          <w:sz w:val="24"/>
+          <w:szCs w:val="24"/>
+        </w:rPr>
+        <w:t xml:space="preserve"> and presentation? Describe any noteworthy technical contributions </w:t>
+      </w:r>
+      <w:proofErr w:type="gramStart"/>
+      <w:r>
+        <w:rPr>
+          <w:rFonts w:ascii="Times New Roman" w:eastAsia="Arial" w:hAnsi="Times New Roman"/>
+          <w:bCs/>
+          <w:color w:val="000000"/>
+          <w:sz w:val="24"/>
+          <w:szCs w:val="24"/>
+        </w:rPr>
+        <w:t>done</w:t>
+      </w:r>
+      <w:proofErr w:type="gramEnd"/>
+      <w:r>
+        <w:rPr>
+          <w:rFonts w:ascii="Times New Roman" w:eastAsia="Arial" w:hAnsi="Times New Roman"/>
+          <w:bCs/>
+          <w:color w:val="000000"/>
+          <w:sz w:val="24"/>
+          <w:szCs w:val="24"/>
+        </w:rPr>
+        <w:t xml:space="preserve"> during the design and implementation of the </w:t>
+      </w:r>
+      <w:proofErr w:type="spellStart"/>
+      <w:r>
+        <w:rPr>
+          <w:rFonts w:ascii="Times New Roman" w:eastAsia="Arial" w:hAnsi="Times New Roman"/>
+          <w:bCs/>
+          <w:color w:val="000000"/>
+          <w:sz w:val="24"/>
+          <w:szCs w:val="24"/>
+        </w:rPr>
+        <w:t>visualisation</w:t>
+      </w:r>
+      <w:proofErr w:type="spellEnd"/>
+      <w:r>
+        <w:rPr>
+          <w:rFonts w:ascii="Times New Roman" w:eastAsia="Arial" w:hAnsi="Times New Roman"/>
+          <w:bCs/>
+          <w:color w:val="000000"/>
+          <w:sz w:val="24"/>
+          <w:szCs w:val="24"/>
+        </w:rPr>
+        <w:t xml:space="preserve">. What were the technically challenging aspects in creating the </w:t>
+      </w:r>
+      <w:proofErr w:type="spellStart"/>
+      <w:r>
+        <w:rPr>
+          <w:rFonts w:ascii="Times New Roman" w:eastAsia="Arial" w:hAnsi="Times New Roman"/>
+          <w:bCs/>
+          <w:color w:val="000000"/>
+          <w:sz w:val="24"/>
+          <w:szCs w:val="24"/>
+        </w:rPr>
+        <w:t>visualisation</w:t>
+      </w:r>
+      <w:proofErr w:type="spellEnd"/>
+      <w:r>
+        <w:rPr>
+          <w:rFonts w:ascii="Times New Roman" w:eastAsia="Arial" w:hAnsi="Times New Roman"/>
+          <w:bCs/>
+          <w:color w:val="000000"/>
+          <w:sz w:val="24"/>
+          <w:szCs w:val="24"/>
+        </w:rPr>
+        <w:t>?</w:t>
       </w:r>
       <w:r>
         <w:rPr>
@@ -771,23 +964,7 @@
           <w:b/>
           <w:color w:val="993300"/>
         </w:rPr>
-        <w:t xml:space="preserve">4. </w:t>
-      </w:r>
-      <w:r>
-        <w:rPr>
-          <w:rFonts w:ascii="Arial" w:eastAsia="Arial" w:hAnsi="Arial" w:cs="Arial"/>
-          <w:b/>
-          <w:color w:val="993300"/>
-        </w:rPr>
-        <w:t>Your Contributions</w:t>
-      </w:r>
-      <w:r>
-        <w:rPr>
-          <w:rFonts w:ascii="Arial" w:eastAsia="Arial" w:hAnsi="Arial" w:cs="Arial"/>
-          <w:b/>
-          <w:color w:val="993300"/>
-        </w:rPr>
-        <w:t xml:space="preserve"> to the Project</w:t>
+        <w:t>4. Your Contributions to the Project</w:t>
       </w:r>
     </w:p>
     <w:p>
@@ -809,6 +986,7 @@
           <w:sz w:val="24"/>
           <w:szCs w:val="24"/>
         </w:rPr>
+        <w:lastRenderedPageBreak/>
         <w:t xml:space="preserve"> By referring to the above content as well as your solution introduced in the presentation video, you are asked to clearly </w:t>
       </w:r>
       <w:r>
@@ -819,77 +997,7 @@
           <w:sz w:val="24"/>
           <w:szCs w:val="24"/>
         </w:rPr>
-        <w:t>introduce</w:t>
-      </w:r>
-      <w:r>
-        <w:rPr>
-          <w:rFonts w:ascii="Times New Roman" w:eastAsia="Arial" w:hAnsi="Times New Roman"/>
-          <w:b/>
-          <w:color w:val="000000"/>
-          <w:sz w:val="24"/>
-          <w:szCs w:val="24"/>
-        </w:rPr>
-        <w:t xml:space="preserve"> your</w:t>
-      </w:r>
-      <w:r>
-        <w:rPr>
-          <w:rFonts w:ascii="Times New Roman" w:eastAsia="Arial" w:hAnsi="Times New Roman"/>
-          <w:b/>
-          <w:color w:val="000000"/>
-          <w:sz w:val="24"/>
-          <w:szCs w:val="24"/>
-        </w:rPr>
-        <w:t xml:space="preserve"> own</w:t>
-      </w:r>
-      <w:r>
-        <w:rPr>
-          <w:rFonts w:ascii="Times New Roman" w:eastAsia="Arial" w:hAnsi="Times New Roman"/>
-          <w:b/>
-          <w:color w:val="000000"/>
-          <w:sz w:val="24"/>
-          <w:szCs w:val="24"/>
-        </w:rPr>
-        <w:t xml:space="preserve"> contributions </w:t>
-      </w:r>
-      <w:r>
-        <w:rPr>
-          <w:rFonts w:ascii="Times New Roman" w:eastAsia="Arial" w:hAnsi="Times New Roman"/>
-          <w:b/>
-          <w:color w:val="000000"/>
-          <w:sz w:val="24"/>
-          <w:szCs w:val="24"/>
-        </w:rPr>
-        <w:t>to</w:t>
-      </w:r>
-      <w:r>
-        <w:rPr>
-          <w:rFonts w:ascii="Times New Roman" w:eastAsia="Arial" w:hAnsi="Times New Roman"/>
-          <w:b/>
-          <w:color w:val="000000"/>
-          <w:sz w:val="24"/>
-          <w:szCs w:val="24"/>
-        </w:rPr>
-        <w:t xml:space="preserve"> th</w:t>
-      </w:r>
-      <w:r>
-        <w:rPr>
-          <w:rFonts w:ascii="Times New Roman" w:eastAsia="Arial" w:hAnsi="Times New Roman"/>
-          <w:b/>
-          <w:color w:val="000000"/>
-          <w:sz w:val="24"/>
-          <w:szCs w:val="24"/>
-        </w:rPr>
-        <w:t>e team project</w:t>
-      </w:r>
-      <w:r>
-        <w:rPr>
-          <w:rFonts w:ascii="Times New Roman" w:eastAsia="Arial" w:hAnsi="Times New Roman"/>
-          <w:b/>
-          <w:color w:val="000000"/>
-          <w:sz w:val="24"/>
-          <w:szCs w:val="24"/>
-        </w:rPr>
-        <w:t>.</w:t>
+        <w:t>introduce your own contributions to the team project.</w:t>
       </w:r>
     </w:p>
     <w:p>
@@ -1137,8 +1245,16 @@
         <w:rPr>
           <w:rFonts w:ascii="Times New Roman" w:hAnsi="Times New Roman"/>
         </w:rPr>
-        <w:t xml:space="preserve"> that have contributed preliminary ideas to your visualisation</w:t>
-      </w:r>
+        <w:t xml:space="preserve"> that have contributed preliminary ideas to your </w:t>
+      </w:r>
+      <w:proofErr w:type="spellStart"/>
+      <w:r>
+        <w:rPr>
+          <w:rFonts w:ascii="Times New Roman" w:hAnsi="Times New Roman"/>
+        </w:rPr>
+        <w:t>visualisation</w:t>
+      </w:r>
+      <w:proofErr w:type="spellEnd"/>
       <w:r>
         <w:rPr>
           <w:rFonts w:ascii="Times New Roman" w:hAnsi="Times New Roman"/>
@@ -1214,6 +1330,125 @@
         <w:spacing w:after="80" w:line="240" w:lineRule="auto"/>
         <w:rPr>
           <w:rFonts w:ascii="Times New Roman" w:hAnsi="Times New Roman"/>
+          <w:lang w:eastAsia="zh-CN"/>
+        </w:rPr>
+      </w:pPr>
+    </w:p>
+    <w:p>
+      <w:pPr>
+        <w:spacing w:after="80" w:line="240" w:lineRule="auto"/>
+        <w:rPr>
+          <w:rFonts w:ascii="Times New Roman" w:hAnsi="Times New Roman"/>
+          <w:lang w:eastAsia="zh-CN"/>
+        </w:rPr>
+      </w:pPr>
+      <w:r>
+        <w:rPr>
+          <w:rFonts w:ascii="Times New Roman" w:hAnsi="Times New Roman"/>
+          <w:lang w:eastAsia="zh-CN"/>
+        </w:rPr>
+        <w:t xml:space="preserve">U.S. Department of Education, National Center for Education Statistics. (n.d.). </w:t>
+      </w:r>
+      <w:r>
+        <w:rPr>
+          <w:rFonts w:ascii="Times New Roman" w:hAnsi="Times New Roman"/>
+          <w:i/>
+          <w:iCs/>
+          <w:lang w:eastAsia="zh-CN"/>
+        </w:rPr>
+        <w:t>Integrated Postsecondary Education Data System (IPEDS)</w:t>
+      </w:r>
+      <w:r>
+        <w:rPr>
+          <w:rFonts w:ascii="Times New Roman" w:hAnsi="Times New Roman"/>
+          <w:lang w:eastAsia="zh-CN"/>
+        </w:rPr>
+        <w:t xml:space="preserve"> [Data set]. Retrieved April 7, 2026, from </w:t>
+      </w:r>
+      <w:hyperlink r:id="rId11" w:tgtFrame="_new" w:history="1">
+        <w:r>
+          <w:rPr>
+            <w:rStyle w:val="ad"/>
+            <w:rFonts w:ascii="Times New Roman" w:hAnsi="Times New Roman"/>
+            <w:lang w:eastAsia="zh-CN"/>
+          </w:rPr>
+          <w:t>https://nces.ed.gov/ipeds/</w:t>
+        </w:r>
+      </w:hyperlink>
+    </w:p>
+    <w:p>
+      <w:pPr>
+        <w:spacing w:after="80" w:line="240" w:lineRule="auto"/>
+        <w:rPr>
+          <w:rFonts w:ascii="Times New Roman" w:hAnsi="Times New Roman"/>
+          <w:lang w:eastAsia="zh-CN"/>
+        </w:rPr>
+      </w:pPr>
+    </w:p>
+    <w:p>
+      <w:pPr>
+        <w:spacing w:after="80" w:line="240" w:lineRule="auto"/>
+        <w:rPr>
+          <w:rFonts w:ascii="Times New Roman" w:hAnsi="Times New Roman"/>
+          <w:lang w:eastAsia="zh-CN"/>
+        </w:rPr>
+      </w:pPr>
+      <w:r>
+        <w:rPr>
+          <w:rFonts w:ascii="Times New Roman" w:hAnsi="Times New Roman"/>
+          <w:lang w:eastAsia="zh-CN"/>
+        </w:rPr>
+        <w:t xml:space="preserve">Federal Reserve Bank of St. Louis. (n.d.). </w:t>
+      </w:r>
+      <w:r>
+        <w:rPr>
+          <w:rFonts w:ascii="Times New Roman" w:hAnsi="Times New Roman"/>
+          <w:i/>
+          <w:iCs/>
+          <w:lang w:eastAsia="zh-CN"/>
+        </w:rPr>
+        <w:t>FRED: Federal Reserve Economic Data</w:t>
+      </w:r>
+      <w:r>
+        <w:rPr>
+          <w:rFonts w:ascii="Times New Roman" w:hAnsi="Times New Roman"/>
+          <w:lang w:eastAsia="zh-CN"/>
+        </w:rPr>
+        <w:t xml:space="preserve"> [Data set]. Retrieved April 7, 2026, from </w:t>
+      </w:r>
+      <w:hyperlink r:id="rId12" w:tgtFrame="_new" w:history="1">
+        <w:r>
+          <w:rPr>
+            <w:rStyle w:val="ad"/>
+            <w:rFonts w:ascii="Times New Roman" w:hAnsi="Times New Roman"/>
+            <w:lang w:eastAsia="zh-CN"/>
+          </w:rPr>
+          <w:t>https://fred.stlouisfed.org/</w:t>
+        </w:r>
+      </w:hyperlink>
+      <w:r>
+        <w:rPr>
+          <w:rFonts w:ascii="Times New Roman" w:hAnsi="Times New Roman"/>
+          <w:lang w:eastAsia="zh-CN"/>
+        </w:rPr>
+        <w:t xml:space="preserve"> </w:t>
+      </w:r>
+    </w:p>
+    <w:p>
+      <w:pPr>
+        <w:spacing w:after="80" w:line="240" w:lineRule="auto"/>
+        <w:rPr>
+          <w:rFonts w:ascii="Times New Roman" w:hAnsi="Times New Roman"/>
+          <w:lang w:eastAsia="zh-CN"/>
+        </w:rPr>
+      </w:pPr>
+    </w:p>
+    <w:p>
+      <w:pPr>
+        <w:spacing w:after="80" w:line="240" w:lineRule="auto"/>
+        <w:rPr>
+          <w:rFonts w:ascii="Times New Roman" w:hAnsi="Times New Roman"/>
+          <w:lang w:eastAsia="zh-CN"/>
         </w:rPr>
       </w:pPr>
     </w:p>
@@ -1425,8 +1660,8 @@
       </w:pPr>
     </w:p>
     <w:sectPr>
-      <w:headerReference w:type="default" r:id="rId11"/>
-      <w:footerReference w:type="default" r:id="rId12"/>
+      <w:headerReference w:type="default" r:id="rId13"/>
+      <w:footerReference w:type="default" r:id="rId14"/>
       <w:type w:val="continuous"/>
       <w:pgSz w:w="11906" w:h="16838" w:code="9"/>
       <w:pgMar w:top="1152" w:right="1008" w:bottom="1152" w:left="1008" w:header="720" w:footer="720" w:gutter="0"/>
@@ -1438,7 +1673,7 @@
 </file>
 
 <file path=word/endnotes.xml><?xml version="1.0" encoding="utf-8"?>
-<w:endnotes xmlns:wpc="http://schemas.microsoft.com/office/word/2010/wordprocessingCanvas" xmlns:cx="http://schemas.microsoft.com/office/drawing/2014/chartex" xmlns:cx1="http://schemas.microsoft.com/office/drawing/2015/9/8/chartex" xmlns:cx2="http://schemas.microsoft.com/office/drawing/2015/10/21/chartex" xmlns:cx3="http://schemas.microsoft.com/office/drawing/2016/5/9/chartex" xmlns:cx4="http://schemas.microsoft.com/office/drawing/2016/5/10/chartex" xmlns:cx5="http://schemas.microsoft.com/office/drawing/2016/5/11/chartex" xmlns:cx6="http://schemas.microsoft.com/office/drawing/2016/5/12/chartex" xmlns:cx7="http://schemas.microsoft.com/office/drawing/2016/5/13/chartex" xmlns:cx8="http://schemas.microsoft.com/office/drawing/2016/5/14/chartex" xmlns:mc="http://schemas.openxmlformats.org/markup-compatibility/2006" xmlns:aink="http://schemas.microsoft.com/office/drawing/2016/ink" xmlns:am3d="http://schemas.microsoft.com/office/drawing/2017/model3d" xmlns:o="urn:schemas-microsoft-com:office:office" xmlns:oel="http://schemas.microsoft.com/office/2019/extlst" xmlns:r="http://schemas.openxmlformats.org/officeDocument/2006/relationships" xmlns:m="http://schemas.openxmlformats.org/officeDocument/2006/math" xmlns:v="urn:schemas-microsoft-com:vml" xmlns:wp14="http://schemas.microsoft.com/office/word/2010/wordprocessingDrawing" xmlns:wp="http://schemas.openxmlformats.org/drawingml/2006/wordprocessingDrawing" xmlns:w10="urn:schemas-microsoft-com:office:word" xmlns:w="http://schemas.openxmlformats.org/wordprocessingml/2006/main" xmlns:w14="http://schemas.microsoft.com/office/word/2010/wordml" xmlns:w15="http://schemas.microsoft.com/office/word/2012/wordml" xmlns:w16cex="http://schemas.microsoft.com/office/word/2018/wordml/cex" xmlns:w16cid="http://schemas.microsoft.com/office/word/2016/wordml/cid" xmlns:w16="http://schemas.microsoft.com/office/word/2018/wordml" xmlns:w16du="http://schemas.microsoft.com/office/word/2023/wordml/word16du" xmlns:w16sdtdh="http://schemas.microsoft.com/office/word/2020/wordml/sdtdatahash" xmlns:w16se="http://schemas.microsoft.com/office/word/2015/wordml/symex" xmlns:wpg="http://schemas.microsoft.com/office/word/2010/wordprocessingGroup" xmlns:wpi="http://schemas.microsoft.com/office/word/2010/wordprocessingInk" xmlns:wne="http://schemas.microsoft.com/office/word/2006/wordml" xmlns:wps="http://schemas.microsoft.com/office/word/2010/wordprocessingShape" mc:Ignorable="w14 w15 w16se w16cid w16 w16cex w16sdtdh w16du wp14">
+<w:endnotes xmlns:wpc="http://schemas.microsoft.com/office/word/2010/wordprocessingCanvas" xmlns:cx="http://schemas.microsoft.com/office/drawing/2014/chartex" xmlns:cx1="http://schemas.microsoft.com/office/drawing/2015/9/8/chartex" xmlns:cx2="http://schemas.microsoft.com/office/drawing/2015/10/21/chartex" xmlns:cx3="http://schemas.microsoft.com/office/drawing/2016/5/9/chartex" xmlns:cx4="http://schemas.microsoft.com/office/drawing/2016/5/10/chartex" xmlns:cx5="http://schemas.microsoft.com/office/drawing/2016/5/11/chartex" xmlns:cx6="http://schemas.microsoft.com/office/drawing/2016/5/12/chartex" xmlns:cx7="http://schemas.microsoft.com/office/drawing/2016/5/13/chartex" xmlns:cx8="http://schemas.microsoft.com/office/drawing/2016/5/14/chartex" xmlns:mc="http://schemas.openxmlformats.org/markup-compatibility/2006" xmlns:aink="http://schemas.microsoft.com/office/drawing/2016/ink" xmlns:am3d="http://schemas.microsoft.com/office/drawing/2017/model3d" xmlns:o="urn:schemas-microsoft-com:office:office" xmlns:oel="http://schemas.microsoft.com/office/2019/extlst" xmlns:r="http://schemas.openxmlformats.org/officeDocument/2006/relationships" xmlns:m="http://schemas.openxmlformats.org/officeDocument/2006/math" xmlns:v="urn:schemas-microsoft-com:vml" xmlns:wp14="http://schemas.microsoft.com/office/word/2010/wordprocessingDrawing" xmlns:wp="http://schemas.openxmlformats.org/drawingml/2006/wordprocessingDrawing" xmlns:w10="urn:schemas-microsoft-com:office:word" xmlns:w="http://schemas.openxmlformats.org/wordprocessingml/2006/main" xmlns:w14="http://schemas.microsoft.com/office/word/2010/wordml" xmlns:w15="http://schemas.microsoft.com/office/word/2012/wordml" xmlns:w16cex="http://schemas.microsoft.com/office/word/2018/wordml/cex" xmlns:w16cid="http://schemas.microsoft.com/office/word/2016/wordml/cid" xmlns:w16="http://schemas.microsoft.com/office/word/2018/wordml" xmlns:w16du="http://schemas.microsoft.com/office/word/2023/wordml/word16du" xmlns:w16sdtdh="http://schemas.microsoft.com/office/word/2020/wordml/sdtdatahash" xmlns:w16sdtfl="http://schemas.microsoft.com/office/word/2024/wordml/sdtformatlock" xmlns:w16se="http://schemas.microsoft.com/office/word/2015/wordml/symex" xmlns:wpg="http://schemas.microsoft.com/office/word/2010/wordprocessingGroup" xmlns:wpi="http://schemas.microsoft.com/office/word/2010/wordprocessingInk" xmlns:wne="http://schemas.microsoft.com/office/word/2006/wordml" xmlns:wps="http://schemas.microsoft.com/office/word/2010/wordprocessingShape" mc:Ignorable="w14 w15 w16se w16cid w16 w16cex w16sdtdh w16sdtfl w16du wp14">
   <w:endnote w:type="separator" w:id="-1">
     <w:p>
       <w:pPr>
@@ -1463,10 +1698,10 @@
 </file>
 
 <file path=word/footer1.xml><?xml version="1.0" encoding="utf-8"?>
-<w:ftr xmlns:wpc="http://schemas.microsoft.com/office/word/2010/wordprocessingCanvas" xmlns:cx="http://schemas.microsoft.com/office/drawing/2014/chartex" xmlns:cx1="http://schemas.microsoft.com/office/drawing/2015/9/8/chartex" xmlns:cx2="http://schemas.microsoft.com/office/drawing/2015/10/21/chartex" xmlns:cx3="http://schemas.microsoft.com/office/drawing/2016/5/9/chartex" xmlns:cx4="http://schemas.microsoft.com/office/drawing/2016/5/10/chartex" xmlns:cx5="http://schemas.microsoft.com/office/drawing/2016/5/11/chartex" xmlns:cx6="http://schemas.microsoft.com/office/drawing/2016/5/12/chartex" xmlns:cx7="http://schemas.microsoft.com/office/drawing/2016/5/13/chartex" xmlns:cx8="http://schemas.microsoft.com/office/drawing/2016/5/14/chartex" xmlns:mc="http://schemas.openxmlformats.org/markup-compatibility/2006" xmlns:aink="http://schemas.microsoft.com/office/drawing/2016/ink" xmlns:am3d="http://schemas.microsoft.com/office/drawing/2017/model3d" xmlns:o="urn:schemas-microsoft-com:office:office" xmlns:oel="http://schemas.microsoft.com/office/2019/extlst" xmlns:r="http://schemas.openxmlformats.org/officeDocument/2006/relationships" xmlns:m="http://schemas.openxmlformats.org/officeDocument/2006/math" xmlns:v="urn:schemas-microsoft-com:vml" xmlns:wp14="http://schemas.microsoft.com/office/word/2010/wordprocessingDrawing" xmlns:wp="http://schemas.openxmlformats.org/drawingml/2006/wordprocessingDrawing" xmlns:w10="urn:schemas-microsoft-com:office:word" xmlns:w="http://schemas.openxmlformats.org/wordprocessingml/2006/main" xmlns:w14="http://schemas.microsoft.com/office/word/2010/wordml" xmlns:w15="http://schemas.microsoft.com/office/word/2012/wordml" xmlns:w16cex="http://schemas.microsoft.com/office/word/2018/wordml/cex" xmlns:w16cid="http://schemas.microsoft.com/office/word/2016/wordml/cid" xmlns:w16="http://schemas.microsoft.com/office/word/2018/wordml" xmlns:w16du="http://schemas.microsoft.com/office/word/2023/wordml/word16du" xmlns:w16sdtdh="http://schemas.microsoft.com/office/word/2020/wordml/sdtdatahash" xmlns:w16se="http://schemas.microsoft.com/office/word/2015/wordml/symex" xmlns:wpg="http://schemas.microsoft.com/office/word/2010/wordprocessingGroup" xmlns:wpi="http://schemas.microsoft.com/office/word/2010/wordprocessingInk" xmlns:wne="http://schemas.microsoft.com/office/word/2006/wordml" xmlns:wps="http://schemas.microsoft.com/office/word/2010/wordprocessingShape" mc:Ignorable="w14 w15 w16se w16cid w16 w16cex w16sdtdh w16du wp14">
+<w:ftr xmlns:wpc="http://schemas.microsoft.com/office/word/2010/wordprocessingCanvas" xmlns:cx="http://schemas.microsoft.com/office/drawing/2014/chartex" xmlns:cx1="http://schemas.microsoft.com/office/drawing/2015/9/8/chartex" xmlns:cx2="http://schemas.microsoft.com/office/drawing/2015/10/21/chartex" xmlns:cx3="http://schemas.microsoft.com/office/drawing/2016/5/9/chartex" xmlns:cx4="http://schemas.microsoft.com/office/drawing/2016/5/10/chartex" xmlns:cx5="http://schemas.microsoft.com/office/drawing/2016/5/11/chartex" xmlns:cx6="http://schemas.microsoft.com/office/drawing/2016/5/12/chartex" xmlns:cx7="http://schemas.microsoft.com/office/drawing/2016/5/13/chartex" xmlns:cx8="http://schemas.microsoft.com/office/drawing/2016/5/14/chartex" xmlns:mc="http://schemas.openxmlformats.org/markup-compatibility/2006" xmlns:aink="http://schemas.microsoft.com/office/drawing/2016/ink" xmlns:am3d="http://schemas.microsoft.com/office/drawing/2017/model3d" xmlns:o="urn:schemas-microsoft-com:office:office" xmlns:oel="http://schemas.microsoft.com/office/2019/extlst" xmlns:r="http://schemas.openxmlformats.org/officeDocument/2006/relationships" xmlns:m="http://schemas.openxmlformats.org/officeDocument/2006/math" xmlns:v="urn:schemas-microsoft-com:vml" xmlns:wp14="http://schemas.microsoft.com/office/word/2010/wordprocessingDrawing" xmlns:wp="http://schemas.openxmlformats.org/drawingml/2006/wordprocessingDrawing" xmlns:w10="urn:schemas-microsoft-com:office:word" xmlns:w="http://schemas.openxmlformats.org/wordprocessingml/2006/main" xmlns:w14="http://schemas.microsoft.com/office/word/2010/wordml" xmlns:w15="http://schemas.microsoft.com/office/word/2012/wordml" xmlns:w16cex="http://schemas.microsoft.com/office/word/2018/wordml/cex" xmlns:w16cid="http://schemas.microsoft.com/office/word/2016/wordml/cid" xmlns:w16="http://schemas.microsoft.com/office/word/2018/wordml" xmlns:w16du="http://schemas.microsoft.com/office/word/2023/wordml/word16du" xmlns:w16sdtdh="http://schemas.microsoft.com/office/word/2020/wordml/sdtdatahash" xmlns:w16sdtfl="http://schemas.microsoft.com/office/word/2024/wordml/sdtformatlock" xmlns:w16se="http://schemas.microsoft.com/office/word/2015/wordml/symex" xmlns:wpg="http://schemas.microsoft.com/office/word/2010/wordprocessingGroup" xmlns:wpi="http://schemas.microsoft.com/office/word/2010/wordprocessingInk" xmlns:wne="http://schemas.microsoft.com/office/word/2006/wordml" xmlns:wps="http://schemas.microsoft.com/office/word/2010/wordprocessingShape" mc:Ignorable="w14 w15 w16se w16cid w16 w16cex w16sdtdh w16sdtfl w16du wp14">
   <w:p>
     <w:pPr>
-      <w:pStyle w:val="Footer"/>
+      <w:pStyle w:val="a9"/>
       <w:tabs>
         <w:tab w:val="clear" w:pos="9026"/>
         <w:tab w:val="left" w:pos="8364"/>
@@ -1476,7 +1711,6 @@
         <w:rFonts w:ascii="Arial" w:hAnsi="Arial" w:cs="Arial"/>
         <w:sz w:val="16"/>
         <w:szCs w:val="16"/>
-        <w:lang w:val="en-SG"/>
       </w:rPr>
     </w:pPr>
     <w:r>
@@ -1484,7 +1718,6 @@
         <w:rFonts w:ascii="Arial" w:hAnsi="Arial" w:cs="Arial"/>
         <w:sz w:val="20"/>
         <w:szCs w:val="20"/>
-        <w:lang w:val="en-SG"/>
       </w:rPr>
       <w:tab/>
     </w:r>
@@ -1493,7 +1726,6 @@
         <w:rFonts w:ascii="Arial" w:hAnsi="Arial" w:cs="Arial"/>
         <w:sz w:val="20"/>
         <w:szCs w:val="20"/>
-        <w:lang w:val="en-SG"/>
       </w:rPr>
       <w:fldChar w:fldCharType="begin"/>
     </w:r>
@@ -1502,7 +1734,6 @@
         <w:rFonts w:ascii="Arial" w:hAnsi="Arial" w:cs="Arial"/>
         <w:sz w:val="20"/>
         <w:szCs w:val="20"/>
-        <w:lang w:val="en-SG"/>
       </w:rPr>
       <w:instrText xml:space="preserve"> PAGE   \* MERGEFORMAT </w:instrText>
     </w:r>
@@ -1511,27 +1742,22 @@
         <w:rFonts w:ascii="Arial" w:hAnsi="Arial" w:cs="Arial"/>
         <w:sz w:val="20"/>
         <w:szCs w:val="20"/>
-        <w:lang w:val="en-SG"/>
       </w:rPr>
       <w:fldChar w:fldCharType="separate"/>
     </w:r>
     <w:r>
       <w:rPr>
         <w:rFonts w:ascii="Arial" w:hAnsi="Arial" w:cs="Arial"/>
-        <w:noProof/>
         <w:sz w:val="20"/>
         <w:szCs w:val="20"/>
-        <w:lang w:val="en-SG"/>
       </w:rPr>
       <w:t>1</w:t>
     </w:r>
     <w:r>
       <w:rPr>
         <w:rFonts w:ascii="Arial" w:hAnsi="Arial" w:cs="Arial"/>
-        <w:noProof/>
         <w:sz w:val="20"/>
         <w:szCs w:val="20"/>
-        <w:lang w:val="en-SG"/>
       </w:rPr>
       <w:fldChar w:fldCharType="end"/>
     </w:r>
@@ -1540,7 +1766,6 @@
         <w:rFonts w:ascii="Arial" w:hAnsi="Arial" w:cs="Arial"/>
         <w:sz w:val="20"/>
         <w:szCs w:val="20"/>
-        <w:lang w:val="en-SG"/>
       </w:rPr>
       <w:tab/>
     </w:r>
@@ -1549,7 +1774,6 @@
         <w:rFonts w:ascii="Arial" w:hAnsi="Arial" w:cs="Arial"/>
         <w:sz w:val="16"/>
         <w:szCs w:val="16"/>
-        <w:lang w:val="en-SG"/>
       </w:rPr>
       <w:t xml:space="preserve"> (</w:t>
     </w:r>
@@ -1558,7 +1782,6 @@
         <w:rFonts w:ascii="Arial" w:hAnsi="Arial" w:cs="Arial"/>
         <w:sz w:val="16"/>
         <w:szCs w:val="16"/>
-        <w:lang w:val="en-SG"/>
       </w:rPr>
       <w:t>08</w:t>
     </w:r>
@@ -1567,7 +1790,6 @@
         <w:rFonts w:ascii="Arial" w:hAnsi="Arial" w:cs="Arial"/>
         <w:sz w:val="16"/>
         <w:szCs w:val="16"/>
-        <w:lang w:val="en-SG"/>
       </w:rPr>
       <w:t xml:space="preserve"> </w:t>
     </w:r>
@@ -1576,7 +1798,6 @@
         <w:rFonts w:ascii="Arial" w:hAnsi="Arial" w:cs="Arial"/>
         <w:sz w:val="16"/>
         <w:szCs w:val="16"/>
-        <w:lang w:val="en-SG"/>
       </w:rPr>
       <w:t>Oct</w:t>
     </w:r>
@@ -1585,7 +1806,6 @@
         <w:rFonts w:ascii="Arial" w:hAnsi="Arial" w:cs="Arial"/>
         <w:sz w:val="16"/>
         <w:szCs w:val="16"/>
-        <w:lang w:val="en-SG"/>
       </w:rPr>
       <w:t xml:space="preserve"> 202</w:t>
     </w:r>
@@ -1594,7 +1814,6 @@
         <w:rFonts w:ascii="Arial" w:hAnsi="Arial" w:cs="Arial"/>
         <w:sz w:val="16"/>
         <w:szCs w:val="16"/>
-        <w:lang w:val="en-SG"/>
       </w:rPr>
       <w:t>4</w:t>
     </w:r>
@@ -1603,7 +1822,6 @@
         <w:rFonts w:ascii="Arial" w:hAnsi="Arial" w:cs="Arial"/>
         <w:sz w:val="16"/>
         <w:szCs w:val="16"/>
-        <w:lang w:val="en-SG"/>
       </w:rPr>
       <w:t>)</w:t>
     </w:r>
@@ -1612,7 +1830,7 @@
 </file>
 
 <file path=word/footnotes.xml><?xml version="1.0" encoding="utf-8"?>
-<w:footnotes xmlns:wpc="http://schemas.microsoft.com/office/word/2010/wordprocessingCanvas" xmlns:cx="http://schemas.microsoft.com/office/drawing/2014/chartex" xmlns:cx1="http://schemas.microsoft.com/office/drawing/2015/9/8/chartex" xmlns:cx2="http://schemas.microsoft.com/office/drawing/2015/10/21/chartex" xmlns:cx3="http://schemas.microsoft.com/office/drawing/2016/5/9/chartex" xmlns:cx4="http://schemas.microsoft.com/office/drawing/2016/5/10/chartex" xmlns:cx5="http://schemas.microsoft.com/office/drawing/2016/5/11/chartex" xmlns:cx6="http://schemas.microsoft.com/office/drawing/2016/5/12/chartex" xmlns:cx7="http://schemas.microsoft.com/office/drawing/2016/5/13/chartex" xmlns:cx8="http://schemas.microsoft.com/office/drawing/2016/5/14/chartex" xmlns:mc="http://schemas.openxmlformats.org/markup-compatibility/2006" xmlns:aink="http://schemas.microsoft.com/office/drawing/2016/ink" xmlns:am3d="http://schemas.microsoft.com/office/drawing/2017/model3d" xmlns:o="urn:schemas-microsoft-com:office:office" xmlns:oel="http://schemas.microsoft.com/office/2019/extlst" xmlns:r="http://schemas.openxmlformats.org/officeDocument/2006/relationships" xmlns:m="http://schemas.openxmlformats.org/officeDocument/2006/math" xmlns:v="urn:schemas-microsoft-com:vml" xmlns:wp14="http://schemas.microsoft.com/office/word/2010/wordprocessingDrawing" xmlns:wp="http://schemas.openxmlformats.org/drawingml/2006/wordprocessingDrawing" xmlns:w10="urn:schemas-microsoft-com:office:word" xmlns:w="http://schemas.openxmlformats.org/wordprocessingml/2006/main" xmlns:w14="http://schemas.microsoft.com/office/word/2010/wordml" xmlns:w15="http://schemas.microsoft.com/office/word/2012/wordml" xmlns:w16cex="http://schemas.microsoft.com/office/word/2018/wordml/cex" xmlns:w16cid="http://schemas.microsoft.com/office/word/2016/wordml/cid" xmlns:w16="http://schemas.microsoft.com/office/word/2018/wordml" xmlns:w16du="http://schemas.microsoft.com/office/word/2023/wordml/word16du" xmlns:w16sdtdh="http://schemas.microsoft.com/office/word/2020/wordml/sdtdatahash" xmlns:w16se="http://schemas.microsoft.com/office/word/2015/wordml/symex" xmlns:wpg="http://schemas.microsoft.com/office/word/2010/wordprocessingGroup" xmlns:wpi="http://schemas.microsoft.com/office/word/2010/wordprocessingInk" xmlns:wne="http://schemas.microsoft.com/office/word/2006/wordml" xmlns:wps="http://schemas.microsoft.com/office/word/2010/wordprocessingShape" mc:Ignorable="w14 w15 w16se w16cid w16 w16cex w16sdtdh w16du wp14">
+<w:footnotes xmlns:wpc="http://schemas.microsoft.com/office/word/2010/wordprocessingCanvas" xmlns:cx="http://schemas.microsoft.com/office/drawing/2014/chartex" xmlns:cx1="http://schemas.microsoft.com/office/drawing/2015/9/8/chartex" xmlns:cx2="http://schemas.microsoft.com/office/drawing/2015/10/21/chartex" xmlns:cx3="http://schemas.microsoft.com/office/drawing/2016/5/9/chartex" xmlns:cx4="http://schemas.microsoft.com/office/drawing/2016/5/10/chartex" xmlns:cx5="http://schemas.microsoft.com/office/drawing/2016/5/11/chartex" xmlns:cx6="http://schemas.microsoft.com/office/drawing/2016/5/12/chartex" xmlns:cx7="http://schemas.microsoft.com/office/drawing/2016/5/13/chartex" xmlns:cx8="http://schemas.microsoft.com/office/drawing/2016/5/14/chartex" xmlns:mc="http://schemas.openxmlformats.org/markup-compatibility/2006" xmlns:aink="http://schemas.microsoft.com/office/drawing/2016/ink" xmlns:am3d="http://schemas.microsoft.com/office/drawing/2017/model3d" xmlns:o="urn:schemas-microsoft-com:office:office" xmlns:oel="http://schemas.microsoft.com/office/2019/extlst" xmlns:r="http://schemas.openxmlformats.org/officeDocument/2006/relationships" xmlns:m="http://schemas.openxmlformats.org/officeDocument/2006/math" xmlns:v="urn:schemas-microsoft-com:vml" xmlns:wp14="http://schemas.microsoft.com/office/word/2010/wordprocessingDrawing" xmlns:wp="http://schemas.openxmlformats.org/drawingml/2006/wordprocessingDrawing" xmlns:w10="urn:schemas-microsoft-com:office:word" xmlns:w="http://schemas.openxmlformats.org/wordprocessingml/2006/main" xmlns:w14="http://schemas.microsoft.com/office/word/2010/wordml" xmlns:w15="http://schemas.microsoft.com/office/word/2012/wordml" xmlns:w16cex="http://schemas.microsoft.com/office/word/2018/wordml/cex" xmlns:w16cid="http://schemas.microsoft.com/office/word/2016/wordml/cid" xmlns:w16="http://schemas.microsoft.com/office/word/2018/wordml" xmlns:w16du="http://schemas.microsoft.com/office/word/2023/wordml/word16du" xmlns:w16sdtdh="http://schemas.microsoft.com/office/word/2020/wordml/sdtdatahash" xmlns:w16sdtfl="http://schemas.microsoft.com/office/word/2024/wordml/sdtformatlock" xmlns:w16se="http://schemas.microsoft.com/office/word/2015/wordml/symex" xmlns:wpg="http://schemas.microsoft.com/office/word/2010/wordprocessingGroup" xmlns:wpi="http://schemas.microsoft.com/office/word/2010/wordprocessingInk" xmlns:wne="http://schemas.microsoft.com/office/word/2006/wordml" xmlns:wps="http://schemas.microsoft.com/office/word/2010/wordprocessingShape" mc:Ignorable="w14 w15 w16se w16cid w16 w16cex w16sdtdh w16sdtfl w16du wp14">
   <w:footnote w:type="separator" w:id="-1">
     <w:p>
       <w:pPr>
@@ -1637,10 +1855,10 @@
 </file>
 
 <file path=word/header1.xml><?xml version="1.0" encoding="utf-8"?>
-<w:hdr xmlns:wpc="http://schemas.microsoft.com/office/word/2010/wordprocessingCanvas" xmlns:cx="http://schemas.microsoft.com/office/drawing/2014/chartex" xmlns:cx1="http://schemas.microsoft.com/office/drawing/2015/9/8/chartex" xmlns:cx2="http://schemas.microsoft.com/office/drawing/2015/10/21/chartex" xmlns:cx3="http://schemas.microsoft.com/office/drawing/2016/5/9/chartex" xmlns:cx4="http://schemas.microsoft.com/office/drawing/2016/5/10/chartex" xmlns:cx5="http://schemas.microsoft.com/office/drawing/2016/5/11/chartex" xmlns:cx6="http://schemas.microsoft.com/office/drawing/2016/5/12/chartex" xmlns:cx7="http://schemas.microsoft.com/office/drawing/2016/5/13/chartex" xmlns:cx8="http://schemas.microsoft.com/office/drawing/2016/5/14/chartex" xmlns:mc="http://schemas.openxmlformats.org/markup-compatibility/2006" xmlns:aink="http://schemas.microsoft.com/office/drawing/2016/ink" xmlns:am3d="http://schemas.microsoft.com/office/drawing/2017/model3d" xmlns:o="urn:schemas-microsoft-com:office:office" xmlns:oel="http://schemas.microsoft.com/office/2019/extlst" xmlns:r="http://schemas.openxmlformats.org/officeDocument/2006/relationships" xmlns:m="http://schemas.openxmlformats.org/officeDocument/2006/math" xmlns:v="urn:schemas-microsoft-com:vml" xmlns:wp14="http://schemas.microsoft.com/office/word/2010/wordprocessingDrawing" xmlns:wp="http://schemas.openxmlformats.org/drawingml/2006/wordprocessingDrawing" xmlns:w10="urn:schemas-microsoft-com:office:word" xmlns:w="http://schemas.openxmlformats.org/wordprocessingml/2006/main" xmlns:w14="http://schemas.microsoft.com/office/word/2010/wordml" xmlns:w15="http://schemas.microsoft.com/office/word/2012/wordml" xmlns:w16cex="http://schemas.microsoft.com/office/word/2018/wordml/cex" xmlns:w16cid="http://schemas.microsoft.com/office/word/2016/wordml/cid" xmlns:w16="http://schemas.microsoft.com/office/word/2018/wordml" xmlns:w16du="http://schemas.microsoft.com/office/word/2023/wordml/word16du" xmlns:w16sdtdh="http://schemas.microsoft.com/office/word/2020/wordml/sdtdatahash" xmlns:w16se="http://schemas.microsoft.com/office/word/2015/wordml/symex" xmlns:wpg="http://schemas.microsoft.com/office/word/2010/wordprocessingGroup" xmlns:wpi="http://schemas.microsoft.com/office/word/2010/wordprocessingInk" xmlns:wne="http://schemas.microsoft.com/office/word/2006/wordml" xmlns:wps="http://schemas.microsoft.com/office/word/2010/wordprocessingShape" mc:Ignorable="w14 w15 w16se w16cid w16 w16cex w16sdtdh w16du wp14">
+<w:hdr xmlns:wpc="http://schemas.microsoft.com/office/word/2010/wordprocessingCanvas" xmlns:cx="http://schemas.microsoft.com/office/drawing/2014/chartex" xmlns:cx1="http://schemas.microsoft.com/office/drawing/2015/9/8/chartex" xmlns:cx2="http://schemas.microsoft.com/office/drawing/2015/10/21/chartex" xmlns:cx3="http://schemas.microsoft.com/office/drawing/2016/5/9/chartex" xmlns:cx4="http://schemas.microsoft.com/office/drawing/2016/5/10/chartex" xmlns:cx5="http://schemas.microsoft.com/office/drawing/2016/5/11/chartex" xmlns:cx6="http://schemas.microsoft.com/office/drawing/2016/5/12/chartex" xmlns:cx7="http://schemas.microsoft.com/office/drawing/2016/5/13/chartex" xmlns:cx8="http://schemas.microsoft.com/office/drawing/2016/5/14/chartex" xmlns:mc="http://schemas.openxmlformats.org/markup-compatibility/2006" xmlns:aink="http://schemas.microsoft.com/office/drawing/2016/ink" xmlns:am3d="http://schemas.microsoft.com/office/drawing/2017/model3d" xmlns:o="urn:schemas-microsoft-com:office:office" xmlns:oel="http://schemas.microsoft.com/office/2019/extlst" xmlns:r="http://schemas.openxmlformats.org/officeDocument/2006/relationships" xmlns:m="http://schemas.openxmlformats.org/officeDocument/2006/math" xmlns:v="urn:schemas-microsoft-com:vml" xmlns:wp14="http://schemas.microsoft.com/office/word/2010/wordprocessingDrawing" xmlns:wp="http://schemas.openxmlformats.org/drawingml/2006/wordprocessingDrawing" xmlns:w10="urn:schemas-microsoft-com:office:word" xmlns:w="http://schemas.openxmlformats.org/wordprocessingml/2006/main" xmlns:w14="http://schemas.microsoft.com/office/word/2010/wordml" xmlns:w15="http://schemas.microsoft.com/office/word/2012/wordml" xmlns:w16cex="http://schemas.microsoft.com/office/word/2018/wordml/cex" xmlns:w16cid="http://schemas.microsoft.com/office/word/2016/wordml/cid" xmlns:w16="http://schemas.microsoft.com/office/word/2018/wordml" xmlns:w16du="http://schemas.microsoft.com/office/word/2023/wordml/word16du" xmlns:w16sdtdh="http://schemas.microsoft.com/office/word/2020/wordml/sdtdatahash" xmlns:w16sdtfl="http://schemas.microsoft.com/office/word/2024/wordml/sdtformatlock" xmlns:w16se="http://schemas.microsoft.com/office/word/2015/wordml/symex" xmlns:wpg="http://schemas.microsoft.com/office/word/2010/wordprocessingGroup" xmlns:wpi="http://schemas.microsoft.com/office/word/2010/wordprocessingInk" xmlns:wne="http://schemas.microsoft.com/office/word/2006/wordml" xmlns:wps="http://schemas.microsoft.com/office/word/2010/wordprocessingShape" mc:Ignorable="w14 w15 w16se w16cid w16 w16cex w16sdtdh w16sdtfl w16du wp14">
   <w:p>
     <w:pPr>
-      <w:pStyle w:val="Header"/>
+      <w:pStyle w:val="a7"/>
       <w:jc w:val="center"/>
       <w:rPr>
         <w:rFonts w:ascii="Arial" w:hAnsi="Arial" w:cs="Arial"/>
@@ -1736,7 +1954,7 @@
 </file>
 
 <file path=word/numbering.xml><?xml version="1.0" encoding="utf-8"?>
-<w:numbering xmlns:wpc="http://schemas.microsoft.com/office/word/2010/wordprocessingCanvas" xmlns:cx="http://schemas.microsoft.com/office/drawing/2014/chartex" xmlns:cx1="http://schemas.microsoft.com/office/drawing/2015/9/8/chartex" xmlns:cx2="http://schemas.microsoft.com/office/drawing/2015/10/21/chartex" xmlns:cx3="http://schemas.microsoft.com/office/drawing/2016/5/9/chartex" xmlns:cx4="http://schemas.microsoft.com/office/drawing/2016/5/10/chartex" xmlns:cx5="http://schemas.microsoft.com/office/drawing/2016/5/11/chartex" xmlns:cx6="http://schemas.microsoft.com/office/drawing/2016/5/12/chartex" xmlns:cx7="http://schemas.microsoft.com/office/drawing/2016/5/13/chartex" xmlns:cx8="http://schemas.microsoft.com/office/drawing/2016/5/14/chartex" xmlns:mc="http://schemas.openxmlformats.org/markup-compatibility/2006" xmlns:aink="http://schemas.microsoft.com/office/drawing/2016/ink" xmlns:am3d="http://schemas.microsoft.com/office/drawing/2017/model3d" xmlns:o="urn:schemas-microsoft-com:office:office" xmlns:oel="http://schemas.microsoft.com/office/2019/extlst" xmlns:r="http://schemas.openxmlformats.org/officeDocument/2006/relationships" xmlns:m="http://schemas.openxmlformats.org/officeDocument/2006/math" xmlns:v="urn:schemas-microsoft-com:vml" xmlns:wp14="http://schemas.microsoft.com/office/word/2010/wordprocessingDrawing" xmlns:wp="http://schemas.openxmlformats.org/drawingml/2006/wordprocessingDrawing" xmlns:w10="urn:schemas-microsoft-com:office:word" xmlns:w="http://schemas.openxmlformats.org/wordprocessingml/2006/main" xmlns:w14="http://schemas.microsoft.com/office/word/2010/wordml" xmlns:w15="http://schemas.microsoft.com/office/word/2012/wordml" xmlns:w16cex="http://schemas.microsoft.com/office/word/2018/wordml/cex" xmlns:w16cid="http://schemas.microsoft.com/office/word/2016/wordml/cid" xmlns:w16="http://schemas.microsoft.com/office/word/2018/wordml" xmlns:w16du="http://schemas.microsoft.com/office/word/2023/wordml/word16du" xmlns:w16sdtdh="http://schemas.microsoft.com/office/word/2020/wordml/sdtdatahash" xmlns:w16se="http://schemas.microsoft.com/office/word/2015/wordml/symex" xmlns:wpg="http://schemas.microsoft.com/office/word/2010/wordprocessingGroup" xmlns:wpi="http://schemas.microsoft.com/office/word/2010/wordprocessingInk" xmlns:wne="http://schemas.microsoft.com/office/word/2006/wordml" xmlns:wps="http://schemas.microsoft.com/office/word/2010/wordprocessingShape" mc:Ignorable="w14 w15 w16se w16cid w16 w16cex w16sdtdh w16du wp14">
+<w:numbering xmlns:wpc="http://schemas.microsoft.com/office/word/2010/wordprocessingCanvas" xmlns:cx="http://schemas.microsoft.com/office/drawing/2014/chartex" xmlns:cx1="http://schemas.microsoft.com/office/drawing/2015/9/8/chartex" xmlns:cx2="http://schemas.microsoft.com/office/drawing/2015/10/21/chartex" xmlns:cx3="http://schemas.microsoft.com/office/drawing/2016/5/9/chartex" xmlns:cx4="http://schemas.microsoft.com/office/drawing/2016/5/10/chartex" xmlns:cx5="http://schemas.microsoft.com/office/drawing/2016/5/11/chartex" xmlns:cx6="http://schemas.microsoft.com/office/drawing/2016/5/12/chartex" xmlns:cx7="http://schemas.microsoft.com/office/drawing/2016/5/13/chartex" xmlns:cx8="http://schemas.microsoft.com/office/drawing/2016/5/14/chartex" xmlns:mc="http://schemas.openxmlformats.org/markup-compatibility/2006" xmlns:aink="http://schemas.microsoft.com/office/drawing/2016/ink" xmlns:am3d="http://schemas.microsoft.com/office/drawing/2017/model3d" xmlns:o="urn:schemas-microsoft-com:office:office" xmlns:oel="http://schemas.microsoft.com/office/2019/extlst" xmlns:r="http://schemas.openxmlformats.org/officeDocument/2006/relationships" xmlns:m="http://schemas.openxmlformats.org/officeDocument/2006/math" xmlns:v="urn:schemas-microsoft-com:vml" xmlns:wp14="http://schemas.microsoft.com/office/word/2010/wordprocessingDrawing" xmlns:wp="http://schemas.openxmlformats.org/drawingml/2006/wordprocessingDrawing" xmlns:w10="urn:schemas-microsoft-com:office:word" xmlns:w="http://schemas.openxmlformats.org/wordprocessingml/2006/main" xmlns:w14="http://schemas.microsoft.com/office/word/2010/wordml" xmlns:w15="http://schemas.microsoft.com/office/word/2012/wordml" xmlns:w16cex="http://schemas.microsoft.com/office/word/2018/wordml/cex" xmlns:w16cid="http://schemas.microsoft.com/office/word/2016/wordml/cid" xmlns:w16="http://schemas.microsoft.com/office/word/2018/wordml" xmlns:w16du="http://schemas.microsoft.com/office/word/2023/wordml/word16du" xmlns:w16sdtdh="http://schemas.microsoft.com/office/word/2020/wordml/sdtdatahash" xmlns:w16sdtfl="http://schemas.microsoft.com/office/word/2024/wordml/sdtformatlock" xmlns:w16se="http://schemas.microsoft.com/office/word/2015/wordml/symex" xmlns:wpg="http://schemas.microsoft.com/office/word/2010/wordprocessingGroup" xmlns:wpi="http://schemas.microsoft.com/office/word/2010/wordprocessingInk" xmlns:wne="http://schemas.microsoft.com/office/word/2006/wordml" xmlns:wps="http://schemas.microsoft.com/office/word/2010/wordprocessingShape" mc:Ignorable="w14 w15 w16se w16cid w16 w16cex w16sdtdh w16sdtfl w16du wp14">
   <w:abstractNum w:abstractNumId="0" w15:restartNumberingAfterBreak="0">
     <w:nsid w:val="05EB2669"/>
     <w:multiLevelType w:val="hybridMultilevel"/>
@@ -3790,12 +4008,12 @@
 </file>
 
 <file path=word/styles.xml><?xml version="1.0" encoding="utf-8"?>
-<w:styles xmlns:mc="http://schemas.openxmlformats.org/markup-compatibility/2006" xmlns:r="http://schemas.openxmlformats.org/officeDocument/2006/relationships" xmlns:w="http://schemas.openxmlformats.org/wordprocessingml/2006/main" xmlns:w14="http://schemas.microsoft.com/office/word/2010/wordml" xmlns:w15="http://schemas.microsoft.com/office/word/2012/wordml" xmlns:w16cex="http://schemas.microsoft.com/office/word/2018/wordml/cex" xmlns:w16cid="http://schemas.microsoft.com/office/word/2016/wordml/cid" xmlns:w16="http://schemas.microsoft.com/office/word/2018/wordml" xmlns:w16du="http://schemas.microsoft.com/office/word/2023/wordml/word16du" xmlns:w16sdtdh="http://schemas.microsoft.com/office/word/2020/wordml/sdtdatahash" xmlns:w16se="http://schemas.microsoft.com/office/word/2015/wordml/symex" mc:Ignorable="w14 w15 w16se w16cid w16 w16cex w16sdtdh w16du">
+<w:styles xmlns:mc="http://schemas.openxmlformats.org/markup-compatibility/2006" xmlns:r="http://schemas.openxmlformats.org/officeDocument/2006/relationships" xmlns:w="http://schemas.openxmlformats.org/wordprocessingml/2006/main" xmlns:w14="http://schemas.microsoft.com/office/word/2010/wordml" xmlns:w15="http://schemas.microsoft.com/office/word/2012/wordml" xmlns:w16cex="http://schemas.microsoft.com/office/word/2018/wordml/cex" xmlns:w16cid="http://schemas.microsoft.com/office/word/2016/wordml/cid" xmlns:w16="http://schemas.microsoft.com/office/word/2018/wordml" xmlns:w16du="http://schemas.microsoft.com/office/word/2023/wordml/word16du" xmlns:w16sdtdh="http://schemas.microsoft.com/office/word/2020/wordml/sdtdatahash" xmlns:w16sdtfl="http://schemas.microsoft.com/office/word/2024/wordml/sdtformatlock" xmlns:w16se="http://schemas.microsoft.com/office/word/2015/wordml/symex" mc:Ignorable="w14 w15 w16se w16cid w16 w16cex w16sdtdh w16sdtfl w16du">
   <w:docDefaults>
     <w:rPrDefault>
       <w:rPr>
-        <w:rFonts w:ascii="Calibri" w:eastAsia="DengXian" w:hAnsi="Calibri" w:cs="Times New Roman"/>
-        <w:lang w:val="en-SG" w:eastAsia="zh-CN" w:bidi="ar-SA"/>
+        <w:rFonts w:ascii="Calibri" w:eastAsia="等线" w:hAnsi="Calibri" w:cs="Times New Roman"/>
+        <w:lang w:val="en-US" w:eastAsia="zh-TW" w:bidi="ar-SA"/>
       </w:rPr>
     </w:rPrDefault>
     <w:pPrDefault/>
@@ -4178,7 +4396,7 @@
     <w:lsdException w:name="Unresolved Mention" w:semiHidden="1" w:unhideWhenUsed="1"/>
     <w:lsdException w:name="Smart Link" w:semiHidden="1" w:unhideWhenUsed="1"/>
   </w:latentStyles>
-  <w:style w:type="paragraph" w:default="1" w:styleId="Normal">
+  <w:style w:type="paragraph" w:default="1" w:styleId="a">
     <w:name w:val="Normal"/>
     <w:qFormat/>
     <w:pPr>
@@ -4187,14 +4405,14 @@
     <w:rPr>
       <w:sz w:val="22"/>
       <w:szCs w:val="22"/>
-      <w:lang w:val="en-GB" w:eastAsia="en-GB"/>
+      <w:lang w:eastAsia="en-GB"/>
     </w:rPr>
   </w:style>
-  <w:style w:type="paragraph" w:styleId="Heading1">
+  <w:style w:type="paragraph" w:styleId="1">
     <w:name w:val="heading 1"/>
-    <w:basedOn w:val="Normal"/>
-    <w:next w:val="Normal"/>
-    <w:link w:val="Heading1Char"/>
+    <w:basedOn w:val="a"/>
+    <w:next w:val="a"/>
+    <w:link w:val="10"/>
     <w:autoRedefine/>
     <w:uiPriority w:val="9"/>
     <w:qFormat/>
@@ -4215,11 +4433,11 @@
       <w:lang w:val="x-none" w:eastAsia="en-US"/>
     </w:rPr>
   </w:style>
-  <w:style w:type="paragraph" w:styleId="Heading2">
+  <w:style w:type="paragraph" w:styleId="2">
     <w:name w:val="heading 2"/>
-    <w:basedOn w:val="Normal"/>
-    <w:next w:val="Normal"/>
-    <w:link w:val="Heading2Char"/>
+    <w:basedOn w:val="a"/>
+    <w:next w:val="a"/>
+    <w:link w:val="20"/>
     <w:autoRedefine/>
     <w:uiPriority w:val="9"/>
     <w:unhideWhenUsed/>
@@ -4241,13 +4459,13 @@
       <w:lang w:val="x-none" w:eastAsia="en-US"/>
     </w:rPr>
   </w:style>
-  <w:style w:type="character" w:default="1" w:styleId="DefaultParagraphFont">
+  <w:style w:type="character" w:default="1" w:styleId="a0">
     <w:name w:val="Default Paragraph Font"/>
     <w:uiPriority w:val="1"/>
     <w:semiHidden/>
     <w:unhideWhenUsed/>
   </w:style>
-  <w:style w:type="table" w:default="1" w:styleId="TableNormal">
+  <w:style w:type="table" w:default="1" w:styleId="a1">
     <w:name w:val="Normal Table"/>
     <w:uiPriority w:val="99"/>
     <w:semiHidden/>
@@ -4262,15 +4480,15 @@
       </w:tblCellMar>
     </w:tblPr>
   </w:style>
-  <w:style w:type="numbering" w:default="1" w:styleId="NoList">
+  <w:style w:type="numbering" w:default="1" w:styleId="a2">
     <w:name w:val="No List"/>
     <w:uiPriority w:val="99"/>
     <w:semiHidden/>
     <w:unhideWhenUsed/>
   </w:style>
-  <w:style w:type="character" w:customStyle="1" w:styleId="Heading1Char">
-    <w:name w:val="Heading 1 Char"/>
-    <w:link w:val="Heading1"/>
+  <w:style w:type="character" w:customStyle="1" w:styleId="10">
+    <w:name w:val="標題 1 字元"/>
+    <w:link w:val="1"/>
     <w:uiPriority w:val="9"/>
     <w:rsid w:val="00AE0387"/>
     <w:rPr>
@@ -4283,9 +4501,9 @@
       <w:lang w:eastAsia="en-US"/>
     </w:rPr>
   </w:style>
-  <w:style w:type="character" w:customStyle="1" w:styleId="Heading2Char">
-    <w:name w:val="Heading 2 Char"/>
-    <w:link w:val="Heading2"/>
+  <w:style w:type="character" w:customStyle="1" w:styleId="20">
+    <w:name w:val="標題 2 字元"/>
+    <w:link w:val="2"/>
     <w:uiPriority w:val="9"/>
     <w:rsid w:val="00B076D0"/>
     <w:rPr>
@@ -4299,7 +4517,7 @@
   </w:style>
   <w:style w:type="paragraph" w:customStyle="1" w:styleId="para">
     <w:name w:val="para"/>
-    <w:basedOn w:val="Normal"/>
+    <w:basedOn w:val="a"/>
     <w:autoRedefine/>
     <w:qFormat/>
     <w:rsid w:val="00AE0387"/>
@@ -4314,7 +4532,7 @@
   </w:style>
   <w:style w:type="paragraph" w:customStyle="1" w:styleId="paralist">
     <w:name w:val="paralist"/>
-    <w:basedOn w:val="Normal"/>
+    <w:basedOn w:val="a"/>
     <w:autoRedefine/>
     <w:uiPriority w:val="99"/>
     <w:qFormat/>
@@ -4335,7 +4553,7 @@
   </w:style>
   <w:style w:type="paragraph" w:customStyle="1" w:styleId="SylabusGrid">
     <w:name w:val="SylabusGrid"/>
-    <w:basedOn w:val="Normal"/>
+    <w:basedOn w:val="a"/>
     <w:qFormat/>
     <w:rsid w:val="00AE0387"/>
     <w:pPr>
@@ -4350,7 +4568,7 @@
   </w:style>
   <w:style w:type="paragraph" w:customStyle="1" w:styleId="SyllabusTopics">
     <w:name w:val="SyllabusTopics"/>
-    <w:basedOn w:val="Normal"/>
+    <w:basedOn w:val="a"/>
     <w:autoRedefine/>
     <w:qFormat/>
     <w:rsid w:val="007E0650"/>
@@ -4365,10 +4583,10 @@
       <w:lang w:eastAsia="en-US"/>
     </w:rPr>
   </w:style>
-  <w:style w:type="paragraph" w:styleId="BodyText">
+  <w:style w:type="paragraph" w:styleId="a3">
     <w:name w:val="Body Text"/>
-    <w:basedOn w:val="Normal"/>
-    <w:link w:val="BodyTextChar"/>
+    <w:basedOn w:val="a"/>
+    <w:link w:val="a4"/>
     <w:uiPriority w:val="99"/>
     <w:semiHidden/>
     <w:unhideWhenUsed/>
@@ -4379,21 +4597,21 @@
       <w:spacing w:after="120" w:line="240" w:lineRule="auto"/>
     </w:pPr>
     <w:rPr>
-      <w:rFonts w:ascii="Liberation Serif" w:eastAsia="SimSun" w:hAnsi="Liberation Serif"/>
+      <w:rFonts w:ascii="Liberation Serif" w:eastAsia="宋体" w:hAnsi="Liberation Serif"/>
       <w:kern w:val="2"/>
       <w:sz w:val="24"/>
       <w:szCs w:val="24"/>
       <w:lang w:val="en-SG" w:eastAsia="en-AU"/>
     </w:rPr>
   </w:style>
-  <w:style w:type="character" w:customStyle="1" w:styleId="BodyTextChar">
-    <w:name w:val="Body Text Char"/>
-    <w:link w:val="BodyText"/>
+  <w:style w:type="character" w:customStyle="1" w:styleId="a4">
+    <w:name w:val="本文 字元"/>
+    <w:link w:val="a3"/>
     <w:uiPriority w:val="99"/>
     <w:semiHidden/>
     <w:rsid w:val="00F9419D"/>
     <w:rPr>
-      <w:rFonts w:ascii="Liberation Serif" w:eastAsia="SimSun" w:hAnsi="Liberation Serif"/>
+      <w:rFonts w:ascii="Liberation Serif" w:eastAsia="宋体" w:hAnsi="Liberation Serif"/>
       <w:kern w:val="2"/>
       <w:sz w:val="24"/>
       <w:szCs w:val="24"/>
@@ -4402,7 +4620,7 @@
   </w:style>
   <w:style w:type="paragraph" w:customStyle="1" w:styleId="SyGrid">
     <w:name w:val="SyGrid"/>
-    <w:basedOn w:val="Normal"/>
+    <w:basedOn w:val="a"/>
     <w:autoRedefine/>
     <w:uiPriority w:val="1"/>
     <w:qFormat/>
@@ -4421,10 +4639,10 @@
       <w:lang w:eastAsia="en-US"/>
     </w:rPr>
   </w:style>
-  <w:style w:type="paragraph" w:styleId="BalloonText">
+  <w:style w:type="paragraph" w:styleId="a5">
     <w:name w:val="Balloon Text"/>
-    <w:basedOn w:val="Normal"/>
-    <w:link w:val="BalloonTextChar"/>
+    <w:basedOn w:val="a"/>
+    <w:link w:val="a6"/>
     <w:uiPriority w:val="99"/>
     <w:semiHidden/>
     <w:unhideWhenUsed/>
@@ -4438,9 +4656,9 @@
       <w:szCs w:val="16"/>
     </w:rPr>
   </w:style>
-  <w:style w:type="character" w:customStyle="1" w:styleId="BalloonTextChar">
-    <w:name w:val="Balloon Text Char"/>
-    <w:link w:val="BalloonText"/>
+  <w:style w:type="character" w:customStyle="1" w:styleId="a6">
+    <w:name w:val="註解方塊文字 字元"/>
+    <w:link w:val="a5"/>
     <w:uiPriority w:val="99"/>
     <w:semiHidden/>
     <w:rsid w:val="00C655A0"/>
@@ -4451,10 +4669,10 @@
       <w:lang w:val="en-GB" w:eastAsia="en-GB"/>
     </w:rPr>
   </w:style>
-  <w:style w:type="paragraph" w:styleId="Header">
+  <w:style w:type="paragraph" w:styleId="a7">
     <w:name w:val="header"/>
-    <w:basedOn w:val="Normal"/>
-    <w:link w:val="HeaderChar"/>
+    <w:basedOn w:val="a"/>
+    <w:link w:val="a8"/>
     <w:uiPriority w:val="99"/>
     <w:unhideWhenUsed/>
     <w:rsid w:val="00013A1D"/>
@@ -4465,9 +4683,9 @@
       </w:tabs>
     </w:pPr>
   </w:style>
-  <w:style w:type="character" w:customStyle="1" w:styleId="HeaderChar">
-    <w:name w:val="Header Char"/>
-    <w:link w:val="Header"/>
+  <w:style w:type="character" w:customStyle="1" w:styleId="a8">
+    <w:name w:val="頁首 字元"/>
+    <w:link w:val="a7"/>
     <w:uiPriority w:val="99"/>
     <w:rsid w:val="00013A1D"/>
     <w:rPr>
@@ -4476,10 +4694,10 @@
       <w:lang w:val="en-GB" w:eastAsia="en-GB"/>
     </w:rPr>
   </w:style>
-  <w:style w:type="paragraph" w:styleId="Footer">
+  <w:style w:type="paragraph" w:styleId="a9">
     <w:name w:val="footer"/>
-    <w:basedOn w:val="Normal"/>
-    <w:link w:val="FooterChar"/>
+    <w:basedOn w:val="a"/>
+    <w:link w:val="aa"/>
     <w:uiPriority w:val="99"/>
     <w:unhideWhenUsed/>
     <w:rsid w:val="00013A1D"/>
@@ -4490,9 +4708,9 @@
       </w:tabs>
     </w:pPr>
   </w:style>
-  <w:style w:type="character" w:customStyle="1" w:styleId="FooterChar">
-    <w:name w:val="Footer Char"/>
-    <w:link w:val="Footer"/>
+  <w:style w:type="character" w:customStyle="1" w:styleId="aa">
+    <w:name w:val="頁尾 字元"/>
+    <w:link w:val="a9"/>
     <w:uiPriority w:val="99"/>
     <w:rsid w:val="00013A1D"/>
     <w:rPr>
@@ -4501,10 +4719,10 @@
       <w:lang w:val="en-GB" w:eastAsia="en-GB"/>
     </w:rPr>
   </w:style>
-  <w:style w:type="paragraph" w:styleId="CommentText">
+  <w:style w:type="paragraph" w:styleId="ab">
     <w:name w:val="annotation text"/>
-    <w:basedOn w:val="Normal"/>
-    <w:link w:val="CommentTextChar"/>
+    <w:basedOn w:val="a"/>
+    <w:link w:val="ac"/>
     <w:uiPriority w:val="99"/>
     <w:unhideWhenUsed/>
     <w:rsid w:val="0070276A"/>
@@ -4513,19 +4731,19 @@
       <w:jc w:val="both"/>
     </w:pPr>
     <w:rPr>
-      <w:rFonts w:ascii="Arial" w:eastAsia="SimHei" w:hAnsi="Arial"/>
+      <w:rFonts w:ascii="Arial" w:eastAsia="黑体" w:hAnsi="Arial"/>
       <w:sz w:val="20"/>
       <w:szCs w:val="20"/>
       <w:lang w:val="en-SG" w:eastAsia="en-US"/>
     </w:rPr>
   </w:style>
-  <w:style w:type="character" w:customStyle="1" w:styleId="CommentTextChar">
-    <w:name w:val="Comment Text Char"/>
-    <w:link w:val="CommentText"/>
+  <w:style w:type="character" w:customStyle="1" w:styleId="ac">
+    <w:name w:val="註解文字 字元"/>
+    <w:link w:val="ab"/>
     <w:uiPriority w:val="99"/>
     <w:rsid w:val="0070276A"/>
     <w:rPr>
-      <w:rFonts w:ascii="Arial" w:eastAsia="SimHei" w:hAnsi="Arial"/>
+      <w:rFonts w:ascii="Arial" w:eastAsia="黑体" w:hAnsi="Arial"/>
       <w:lang w:eastAsia="en-US"/>
     </w:rPr>
   </w:style>
@@ -4538,13 +4756,14 @@
       <w:adjustRightInd w:val="0"/>
     </w:pPr>
     <w:rPr>
-      <w:rFonts w:ascii="Arial" w:eastAsia="SimSun" w:hAnsi="Arial" w:cs="Arial"/>
+      <w:rFonts w:ascii="Arial" w:eastAsia="宋体" w:hAnsi="Arial" w:cs="Arial"/>
       <w:color w:val="000000"/>
       <w:sz w:val="24"/>
       <w:szCs w:val="24"/>
+      <w:lang w:val="en-SG" w:eastAsia="zh-CN"/>
     </w:rPr>
   </w:style>
-  <w:style w:type="character" w:styleId="Hyperlink">
+  <w:style w:type="character" w:styleId="ad">
     <w:name w:val="Hyperlink"/>
     <w:rsid w:val="00400083"/>
     <w:rPr>
@@ -4552,9 +4771,9 @@
       <w:u w:val="single"/>
     </w:rPr>
   </w:style>
-  <w:style w:type="paragraph" w:styleId="NormalWeb">
+  <w:style w:type="paragraph" w:styleId="Web">
     <w:name w:val="Normal (Web)"/>
-    <w:basedOn w:val="Normal"/>
+    <w:basedOn w:val="a"/>
     <w:uiPriority w:val="99"/>
     <w:unhideWhenUsed/>
     <w:rsid w:val="00400083"/>
@@ -4565,12 +4784,12 @@
       <w:rFonts w:ascii="Times New Roman" w:eastAsia="Calibri" w:hAnsi="Times New Roman"/>
       <w:sz w:val="24"/>
       <w:szCs w:val="24"/>
-      <w:lang w:val="en-US" w:eastAsia="en-US"/>
+      <w:lang w:eastAsia="en-US"/>
     </w:rPr>
   </w:style>
-  <w:style w:type="paragraph" w:styleId="ListParagraph">
+  <w:style w:type="paragraph" w:styleId="ae">
     <w:name w:val="List Paragraph"/>
-    <w:basedOn w:val="Normal"/>
+    <w:basedOn w:val="a"/>
     <w:uiPriority w:val="34"/>
     <w:qFormat/>
     <w:rsid w:val="00400083"/>
@@ -4587,12 +4806,12 @@
       <w:lang w:eastAsia="zh-CN"/>
     </w:rPr>
   </w:style>
-  <w:style w:type="character" w:styleId="PageNumber">
+  <w:style w:type="character" w:styleId="af">
     <w:name w:val="page number"/>
-    <w:basedOn w:val="DefaultParagraphFont"/>
+    <w:basedOn w:val="a0"/>
     <w:rsid w:val="00833E44"/>
   </w:style>
-  <w:style w:type="character" w:styleId="UnresolvedMention">
+  <w:style w:type="character" w:styleId="af0">
     <w:name w:val="Unresolved Mention"/>
     <w:uiPriority w:val="99"/>
     <w:semiHidden/>
@@ -4603,9 +4822,9 @@
       <w:shd w:val="clear" w:color="auto" w:fill="E1DFDD"/>
     </w:rPr>
   </w:style>
-  <w:style w:type="table" w:styleId="TableGrid">
+  <w:style w:type="table" w:styleId="af1">
     <w:name w:val="Table Grid"/>
-    <w:basedOn w:val="TableNormal"/>
+    <w:basedOn w:val="a1"/>
     <w:uiPriority w:val="59"/>
     <w:rsid w:val="003C3722"/>
     <w:tblPr>
@@ -4619,7 +4838,7 @@
       </w:tblBorders>
     </w:tblPr>
   </w:style>
-  <w:style w:type="paragraph" w:styleId="Revision">
+  <w:style w:type="paragraph" w:styleId="af2">
     <w:name w:val="Revision"/>
     <w:hidden/>
     <w:uiPriority w:val="99"/>

</xml_diff>